<commit_message>
docs: add capacity scaling roadmap
</commit_message>
<xml_diff>
--- a/docs/generated/product-spec-evidence-report.docx
+++ b/docs/generated/product-spec-evidence-report.docx
@@ -1195,7 +1195,7 @@
         <w:pStyle w:val="ListBullet"/>
       </w:pPr>
       <w:r>
-        <w:t xml:space="preserve">• Implementation evidence: apps/core-api/src/modules/gift/gift.controller.ts:37 — contains export class GiftController</w:t>
+        <w:t xml:space="preserve">• Implementation evidence: apps/core-api/src/modules/gift/gift.controller.ts:38 — contains export class GiftController</w:t>
       </w:r>
     </w:p>
     <w:p>
@@ -1299,7 +1299,7 @@
         <w:pStyle w:val="ListBullet"/>
       </w:pPr>
       <w:r>
-        <w:t xml:space="preserve">• Verification evidence (automated-test-source): apps/core-api/src/modules/feed/feed.integration.spec.ts:13 — contains Feed</w:t>
+        <w:t xml:space="preserve">• Verification evidence (automated-test-source): apps/core-api/src/modules/feed/feed.integration.spec.ts:14 — contains Feed</w:t>
       </w:r>
     </w:p>
     <w:p>
@@ -1435,7 +1435,7 @@
         <w:pStyle w:val="ListBullet"/>
       </w:pPr>
       <w:r>
-        <w:t xml:space="preserve">• Implementation evidence: apps/core-api/src/modules/notification/notification.controller.ts:28 — contains @Controller('notifications')</w:t>
+        <w:t xml:space="preserve">• Implementation evidence: apps/core-api/src/modules/notification/notification.controller.ts:35 — contains @Controller('notifications')</w:t>
       </w:r>
     </w:p>
     <w:p>
@@ -2067,7 +2067,7 @@
         <w:pStyle w:val="ListBullet"/>
       </w:pPr>
       <w:r>
-        <w:t xml:space="preserve">• Source evidence: package.json:39 — contains "agent:check":; scripts/agent/verify.mjs:26 — contains requiredTargets: ['lint', 'test', 'build']</w:t>
+        <w:t xml:space="preserve">• Source evidence: package.json:39 — contains "agent:check":; scripts/agent/verify.mjs:34 — contains requiredTargets: ['lint', 'test', 'build']</w:t>
       </w:r>
     </w:p>
     <w:p>
@@ -2211,7 +2211,7 @@
         <w:pStyle w:val="TableCell"/>
       </w:pPr>
       <w:r>
-        <w:t xml:space="preserve">Guard location: apps/core-api/src/database/migrations/1754900000000-report-target-video.ts:31 — contains CREATE UNIQUE INDEX uqreportsvideo_reporter; apps/core-api/src/modules/safety/safety.service.ts:163 — contains if (!isUniqueViolation(err)) throw err;</w:t>
+        <w:t xml:space="preserve">Guard location: apps/core-api/src/database/migrations/1754900000000-report-target-video.ts:31 — contains CREATE UNIQUE INDEX uqreportsvideo_reporter; apps/core-api/src/modules/safety/safety.service.ts:171 — contains if (!isUniqueViolation(err)) throw err;</w:t>
       </w:r>
     </w:p>
     <w:p>
@@ -2291,7 +2291,7 @@
         <w:pStyle w:val="TableCell"/>
       </w:pPr>
       <w:r>
-        <w:t xml:space="preserve">Guard location: apps/core-api/src/modules/safety/safety.service.ts:159 — contains trustPenaltyApplied: 0; apps/core-api/src/modules/short-video/short-video.integration.spec.ts:318 — contains report vượt VIDEOREPORTAUTOHIDE_THRESHOLD</w:t>
+        <w:t xml:space="preserve">Guard location: apps/core-api/src/modules/safety/safety.service.ts:167 — contains trustPenaltyApplied: 0; apps/core-api/src/modules/short-video/short-video.integration.spec.ts:318 — contains report vượt VIDEOREPORTAUTOHIDE_THRESHOLD</w:t>
       </w:r>
     </w:p>
     <w:p>

</xml_diff>

<commit_message>
docs(generated): sinh lại báo cáo bằng chứng product/spec sau khi vị trí source dịch chuyển
Chạy pnpm docs:generate (DOCX sinh bằng shim 7-Zip vì máy Windows không có zip/unzip); handbook DOCX giữ
nguyên vì nội dung vẫn hợp lệ. pnpm docs:check PASS.

Co-Authored-By: Claude Sonnet 5.5 <noreply@anthropic.com>
</commit_message>
<xml_diff>
--- a/docs/generated/product-spec-evidence-report.docx
+++ b/docs/generated/product-spec-evidence-report.docx
@@ -1819,15 +1819,15 @@
         <w:pStyle w:val="ListBullet"/>
       </w:pPr>
       <w:r>
-        <w:t xml:space="preserve">• Implementation evidence: apps/signaling-gateway/src/app/signaling.gateway.ts:45 — contains @WebSocketGateway; libs/common-dtos/src/lib/realtime-events.ts:34 — contains export const RealtimeEvents; apps/signaling-gateway/src/app/connection-quota.service.ts:66 — contains ConnectionQuotaService</w:t>
-      </w:r>
-    </w:p>
-    <w:p>
-      <w:pPr>
-        <w:pStyle w:val="ListBullet"/>
-      </w:pPr>
-      <w:r>
-        <w:t xml:space="preserve">• Verification evidence (automated-test-source): apps/signaling-gateway/src/app/signaling.integration.spec.ts:109 — contains event chỉ tới ĐÚNG user; apps/signaling-gateway/src/app/signaling.horizontal-scale.integration.spec.ts:175 — contains quota per-user atomic xuyên 2 instance</w:t>
+        <w:t xml:space="preserve">• Implementation evidence: apps/signaling-gateway/src/app/signaling.gateway.ts:46 — contains @WebSocketGateway; libs/common-dtos/src/lib/realtime-events.ts:34 — contains export const RealtimeEvents; apps/signaling-gateway/src/app/connection-quota.service.ts:66 — contains ConnectionQuotaService</w:t>
+      </w:r>
+    </w:p>
+    <w:p>
+      <w:pPr>
+        <w:pStyle w:val="ListBullet"/>
+      </w:pPr>
+      <w:r>
+        <w:t xml:space="preserve">• Verification evidence (automated-test-source): apps/signaling-gateway/src/app/signaling.integration.spec.ts:109 — contains event chỉ tới ĐÚNG user; apps/signaling-gateway/src/app/signaling.horizontal-scale.integration.spec.ts:195 — contains quota per-user atomic xuyên 2 instance</w:t>
       </w:r>
     </w:p>
     <w:p>
@@ -1947,7 +1947,7 @@
         <w:pStyle w:val="ListBullet"/>
       </w:pPr>
       <w:r>
-        <w:t xml:space="preserve">• Source evidence: apps/core-api/src/modules/short-video/short-video.service.spec.ts:438 — contains vượt ngưỡng distinct reporter; apps/core-api/src/modules/short-video/short-video.integration.spec.ts:353 — contains cùng 1 người report lặp lại 1 video</w:t>
+        <w:t xml:space="preserve">• Source evidence: apps/core-api/src/modules/short-video/short-video.service.spec.ts:506 — contains vượt ngưỡng distinct reporter; apps/core-api/src/modules/short-video/short-video.integration.spec.ts:378 — contains cùng 1 người report lặp lại 1 video</w:t>
       </w:r>
     </w:p>
     <w:p>
@@ -2131,7 +2131,7 @@
         <w:pStyle w:val="TableCell"/>
       </w:pPr>
       <w:r>
-        <w:t xml:space="preserve">Guard location: apps/core-api/src/app/app.module.ts:117 — contains { provide: APP_GUARD, useClass: JwtAuthGuard }; apps/core-api/src/modules/short-video/short-video.controller.ts:129 — contains await this.videoService.reportVideo(user, id, dto.reason, dto.description);</w:t>
+        <w:t xml:space="preserve">Guard location: apps/core-api/src/app/app.module.ts:131 — contains { provide: APP_GUARD, useClass: JwtAuthGuard }; apps/core-api/src/modules/short-video/short-video.controller.ts:129 — contains await this.videoService.reportVideo(user, id, dto.reason, dto.description);</w:t>
       </w:r>
     </w:p>
     <w:p>
@@ -2171,7 +2171,7 @@
         <w:pStyle w:val="TableCell"/>
       </w:pPr>
       <w:r>
-        <w:t xml:space="preserve">Guard location: apps/core-api/src/modules/short-video/short-video.service.ts:481 — contains Chốt target tồn tại/visible trước khi ghi report; apps/core-api/src/modules/short-video/short-video.service.spec.ts:430 — contains validate video tồn tại trước khi gọi Safety</w:t>
+        <w:t xml:space="preserve">Guard location: apps/core-api/src/modules/short-video/short-video.service.ts:479 — contains Chốt target tồn tại/visible trước khi ghi report; apps/core-api/src/modules/short-video/short-video.service.spec.ts:498 — contains validate video tồn tại trước khi gọi Safety</w:t>
       </w:r>
     </w:p>
     <w:p>
@@ -2251,7 +2251,7 @@
         <w:pStyle w:val="TableCell"/>
       </w:pPr>
       <w:r>
-        <w:t xml:space="preserve">Guard location: apps/core-api/src/modules/short-video/short-video.service.ts:492 — contains if (distinctReporterCount &gt;= threshold); apps/core-api/src/modules/short-video/short-video.service.ts:499 — contains return this.transition(videoId, VideoStatus.Published, VideoStatus.Removed);</w:t>
+        <w:t xml:space="preserve">Guard location: apps/core-api/src/modules/short-video/short-video.service.ts:490 — contains if (distinctReporterCount &gt;= threshold); apps/core-api/src/modules/short-video/short-video.service.ts:497 — contains return this.transition(videoId, VideoStatus.Published, VideoStatus.Removed);</w:t>
       </w:r>
     </w:p>
     <w:p>
@@ -2291,7 +2291,7 @@
         <w:pStyle w:val="TableCell"/>
       </w:pPr>
       <w:r>
-        <w:t xml:space="preserve">Guard location: apps/core-api/src/modules/safety/safety.service.ts:167 — contains trustPenaltyApplied: 0; apps/core-api/src/modules/short-video/short-video.integration.spec.ts:318 — contains report vượt VIDEOREPORTAUTOHIDE_THRESHOLD</w:t>
+        <w:t xml:space="preserve">Guard location: apps/core-api/src/modules/safety/safety.service.ts:167 — contains trustPenaltyApplied: 0; apps/core-api/src/modules/short-video/short-video.integration.spec.ts:343 — contains report vượt VIDEOREPORTAUTOHIDE_THRESHOLD</w:t>
       </w:r>
     </w:p>
     <w:p>

</xml_diff>

<commit_message>
docs(generated): sinh lại báo cáo bằng chứng product/spec sau các sửa theo rà soát
pnpm docs:check PASS (DOCX sinh bằng shim 7-Zip; handbook DOCX giữ nguyên).

Co-Authored-By: Claude Sonnet 5.5 <noreply@anthropic.com>
</commit_message>
<xml_diff>
--- a/docs/generated/product-spec-evidence-report.docx
+++ b/docs/generated/product-spec-evidence-report.docx
@@ -1947,7 +1947,7 @@
         <w:pStyle w:val="ListBullet"/>
       </w:pPr>
       <w:r>
-        <w:t xml:space="preserve">• Source evidence: apps/core-api/src/modules/short-video/short-video.service.spec.ts:506 — contains vượt ngưỡng distinct reporter; apps/core-api/src/modules/short-video/short-video.integration.spec.ts:378 — contains cùng 1 người report lặp lại 1 video</w:t>
+        <w:t xml:space="preserve">• Source evidence: apps/core-api/src/modules/short-video/short-video.service.spec.ts:528 — contains vượt ngưỡng distinct reporter; apps/core-api/src/modules/short-video/short-video.integration.spec.ts:445 — contains cùng 1 người report lặp lại 1 video</w:t>
       </w:r>
     </w:p>
     <w:p>
@@ -2131,7 +2131,7 @@
         <w:pStyle w:val="TableCell"/>
       </w:pPr>
       <w:r>
-        <w:t xml:space="preserve">Guard location: apps/core-api/src/app/app.module.ts:131 — contains { provide: APP_GUARD, useClass: JwtAuthGuard }; apps/core-api/src/modules/short-video/short-video.controller.ts:129 — contains await this.videoService.reportVideo(user, id, dto.reason, dto.description);</w:t>
+        <w:t xml:space="preserve">Guard location: apps/core-api/src/app/app.module.ts:155 — contains { provide: APP_GUARD, useClass: JwtAuthGuard }; apps/core-api/src/modules/short-video/short-video.controller.ts:129 — contains await this.videoService.reportVideo(user, id, dto.reason, dto.description);</w:t>
       </w:r>
     </w:p>
     <w:p>
@@ -2171,7 +2171,7 @@
         <w:pStyle w:val="TableCell"/>
       </w:pPr>
       <w:r>
-        <w:t xml:space="preserve">Guard location: apps/core-api/src/modules/short-video/short-video.service.ts:479 — contains Chốt target tồn tại/visible trước khi ghi report; apps/core-api/src/modules/short-video/short-video.service.spec.ts:498 — contains validate video tồn tại trước khi gọi Safety</w:t>
+        <w:t xml:space="preserve">Guard location: apps/core-api/src/modules/short-video/short-video.service.ts:489 — contains Chốt target tồn tại/visible trước khi ghi report; apps/core-api/src/modules/short-video/short-video.service.spec.ts:520 — contains validate video tồn tại trước khi gọi Safety</w:t>
       </w:r>
     </w:p>
     <w:p>
@@ -2251,7 +2251,7 @@
         <w:pStyle w:val="TableCell"/>
       </w:pPr>
       <w:r>
-        <w:t xml:space="preserve">Guard location: apps/core-api/src/modules/short-video/short-video.service.ts:490 — contains if (distinctReporterCount &gt;= threshold); apps/core-api/src/modules/short-video/short-video.service.ts:497 — contains return this.transition(videoId, VideoStatus.Published, VideoStatus.Removed);</w:t>
+        <w:t xml:space="preserve">Guard location: apps/core-api/src/modules/short-video/short-video.service.ts:500 — contains if (distinctReporterCount &gt;= threshold); apps/core-api/src/modules/short-video/short-video.service.ts:507 — contains return this.transition(videoId, VideoStatus.Published, VideoStatus.Removed);</w:t>
       </w:r>
     </w:p>
     <w:p>
@@ -2291,7 +2291,7 @@
         <w:pStyle w:val="TableCell"/>
       </w:pPr>
       <w:r>
-        <w:t xml:space="preserve">Guard location: apps/core-api/src/modules/safety/safety.service.ts:167 — contains trustPenaltyApplied: 0; apps/core-api/src/modules/short-video/short-video.integration.spec.ts:343 — contains report vượt VIDEOREPORTAUTOHIDE_THRESHOLD</w:t>
+        <w:t xml:space="preserve">Guard location: apps/core-api/src/modules/safety/safety.service.ts:167 — contains trustPenaltyApplied: 0; apps/core-api/src/modules/short-video/short-video.integration.spec.ts:410 — contains report vượt VIDEOREPORTAUTOHIDE_THRESHOLD</w:t>
       </w:r>
     </w:p>
     <w:p>

</xml_diff>

<commit_message>
perf(short-video): index ranked, ranking xoay theo rank_computed_at, counter đệm Redis; sửa phân trang duyệt và xoá comment (C14, C15)
- Migration 1758200000000: cột rank_computed_at, idx_videos_ranked (sort=ranked) và idx_videos_rank_due (xoay vòng), tạo CONCURRENTLY.
- VideoRankingService tính lại theo lô SKIP LOCKED, video mới trước, số lô mỗi tick cấu hình được.
- Counter view/like/comment đệm trên Redis (VIDEO_COUNTER_BUFFER_ENABLED, tắt mặc định), flush một câu UPDATE unnest, fail-open về DB.
- Sửa phân trang hàng chờ duyệt (cursor > theo mili giây) và deleteComment bấm đúp trừ đếm hai lần.
</commit_message>
<xml_diff>
--- a/docs/generated/product-spec-evidence-report.docx
+++ b/docs/generated/product-spec-evidence-report.docx
@@ -1675,15 +1675,15 @@
         <w:pStyle w:val="ListBullet"/>
       </w:pPr>
       <w:r>
-        <w:t xml:space="preserve">• Implementation evidence: apps/core-api/src/modules/short-video/short-video.controller.ts:48 — contains @Controller('videos'); apps/core-api/src/modules/short-video/jobs/video-ranking.service.ts:28 — contains VideoRankingService</w:t>
-      </w:r>
-    </w:p>
-    <w:p>
-      <w:pPr>
-        <w:pStyle w:val="ListBullet"/>
-      </w:pPr>
-      <w:r>
-        <w:t xml:space="preserve">• Verification evidence (automated-test-source): apps/core-api/src/modules/short-video/short-video.integration.spec.ts:12 — contains Short</w:t>
+        <w:t xml:space="preserve">• Implementation evidence: apps/core-api/src/modules/short-video/short-video.controller.ts:48 — contains @Controller('videos'); apps/core-api/src/modules/short-video/jobs/video-ranking.service.ts:32 — contains VideoRankingService</w:t>
+      </w:r>
+    </w:p>
+    <w:p>
+      <w:pPr>
+        <w:pStyle w:val="ListBullet"/>
+      </w:pPr>
+      <w:r>
+        <w:t xml:space="preserve">• Verification evidence (automated-test-source): apps/core-api/src/modules/short-video/short-video.integration.spec.ts:13 — contains Short</w:t>
       </w:r>
     </w:p>
     <w:p>
@@ -1947,7 +1947,7 @@
         <w:pStyle w:val="ListBullet"/>
       </w:pPr>
       <w:r>
-        <w:t xml:space="preserve">• Source evidence: apps/core-api/src/modules/short-video/short-video.service.spec.ts:528 — contains vượt ngưỡng distinct reporter; apps/core-api/src/modules/short-video/short-video.integration.spec.ts:445 — contains cùng 1 người report lặp lại 1 video</w:t>
+        <w:t xml:space="preserve">• Source evidence: apps/core-api/src/modules/short-video/short-video.service.spec.ts:528 — contains vượt ngưỡng distinct reporter; apps/core-api/src/modules/short-video/short-video.integration.spec.ts:473 — contains cùng 1 người report lặp lại 1 video</w:t>
       </w:r>
     </w:p>
     <w:p>
@@ -2171,7 +2171,7 @@
         <w:pStyle w:val="TableCell"/>
       </w:pPr>
       <w:r>
-        <w:t xml:space="preserve">Guard location: apps/core-api/src/modules/short-video/short-video.service.ts:489 — contains Chốt target tồn tại/visible trước khi ghi report; apps/core-api/src/modules/short-video/short-video.service.spec.ts:520 — contains validate video tồn tại trước khi gọi Safety</w:t>
+        <w:t xml:space="preserve">Guard location: apps/core-api/src/modules/short-video/short-video.service.ts:559 — contains Chốt target tồn tại/visible trước khi ghi report; apps/core-api/src/modules/short-video/short-video.service.spec.ts:520 — contains validate video tồn tại trước khi gọi Safety</w:t>
       </w:r>
     </w:p>
     <w:p>
@@ -2251,7 +2251,7 @@
         <w:pStyle w:val="TableCell"/>
       </w:pPr>
       <w:r>
-        <w:t xml:space="preserve">Guard location: apps/core-api/src/modules/short-video/short-video.service.ts:500 — contains if (distinctReporterCount &gt;= threshold); apps/core-api/src/modules/short-video/short-video.service.ts:507 — contains return this.transition(videoId, VideoStatus.Published, VideoStatus.Removed);</w:t>
+        <w:t xml:space="preserve">Guard location: apps/core-api/src/modules/short-video/short-video.service.ts:570 — contains if (distinctReporterCount &gt;= threshold); apps/core-api/src/modules/short-video/short-video.service.ts:577 — contains return this.transition(videoId, VideoStatus.Published, VideoStatus.Removed);</w:t>
       </w:r>
     </w:p>
     <w:p>
@@ -2291,7 +2291,7 @@
         <w:pStyle w:val="TableCell"/>
       </w:pPr>
       <w:r>
-        <w:t xml:space="preserve">Guard location: apps/core-api/src/modules/safety/safety.service.ts:195 — contains trustPenaltyApplied: 0; apps/core-api/src/modules/short-video/short-video.integration.spec.ts:410 — contains report vượt VIDEOREPORTAUTOHIDE_THRESHOLD</w:t>
+        <w:t xml:space="preserve">Guard location: apps/core-api/src/modules/safety/safety.service.ts:195 — contains trustPenaltyApplied: 0; apps/core-api/src/modules/short-video/short-video.integration.spec.ts:438 — contains report vượt VIDEOREPORTAUTOHIDE_THRESHOLD</w:t>
       </w:r>
     </w:p>
     <w:p>

</xml_diff>

<commit_message>
feat(admin,short-video,party): broadcast Idempotency-Key và huỷ; ranking theo hạn tính lại; bình luận phòng party chỉ FOR SHARE (C20–C22)
- Broadcast: header Idempotency-Key bắt buộc, unique một phần theo người gửi; gửi lại trả broadcast cũ, khác nội dung thì 409, đua đồng thời chỉ một bản; POST .../:id/cancel (idempotent) chặn các lô chưa gửi. Admin UI giữ một khoá cho mỗi nội dung. Migration 1758600000000, OpenAPI và api-client sinh lại.
- Ranking video theo hạn tính lại rank_due_at: khoảng = STALENESS_PCT% x (decay + tuổi) kẹp [60 giây, MAX_INTERVAL], counter và flush kéo hạn về sớm; công việc tỉ lệ với video trẻ/hoạt động thay vì xoay cả catalogue. Migration 1758700000000 (index mới thay idx_videos_rank_due).
- Party room: gửi bình luận giữ FOR SHARE trên hàng phòng nên các bình luận không xếp hàng nhau; join/leave vẫn FOR UPDATE; fanout chỉ đọc user_id; PARTY_MAX_MEMBERS có trần 500.
</commit_message>
<xml_diff>
--- a/docs/generated/product-spec-evidence-report.docx
+++ b/docs/generated/product-spec-evidence-report.docx
@@ -1675,7 +1675,7 @@
         <w:pStyle w:val="ListBullet"/>
       </w:pPr>
       <w:r>
-        <w:t xml:space="preserve">• Implementation evidence: apps/core-api/src/modules/short-video/short-video.controller.ts:48 — contains @Controller('videos'); apps/core-api/src/modules/short-video/jobs/video-ranking.service.ts:32 — contains VideoRankingService</w:t>
+        <w:t xml:space="preserve">• Implementation evidence: apps/core-api/src/modules/short-video/short-video.controller.ts:48 — contains @Controller('videos'); apps/core-api/src/modules/short-video/jobs/video-ranking.service.ts:36 — contains VideoRankingService</w:t>
       </w:r>
     </w:p>
     <w:p>
@@ -1947,7 +1947,7 @@
         <w:pStyle w:val="ListBullet"/>
       </w:pPr>
       <w:r>
-        <w:t xml:space="preserve">• Source evidence: apps/core-api/src/modules/short-video/short-video.service.spec.ts:528 — contains vượt ngưỡng distinct reporter; apps/core-api/src/modules/short-video/short-video.integration.spec.ts:473 — contains cùng 1 người report lặp lại 1 video</w:t>
+        <w:t xml:space="preserve">• Source evidence: apps/core-api/src/modules/short-video/short-video.service.spec.ts:533 — contains vượt ngưỡng distinct reporter; apps/core-api/src/modules/short-video/short-video.integration.spec.ts:478 — contains cùng 1 người report lặp lại 1 video</w:t>
       </w:r>
     </w:p>
     <w:p>
@@ -2171,7 +2171,7 @@
         <w:pStyle w:val="TableCell"/>
       </w:pPr>
       <w:r>
-        <w:t xml:space="preserve">Guard location: apps/core-api/src/modules/short-video/short-video.service.ts:559 — contains Chốt target tồn tại/visible trước khi ghi report; apps/core-api/src/modules/short-video/short-video.service.spec.ts:520 — contains validate video tồn tại trước khi gọi Safety</w:t>
+        <w:t xml:space="preserve">Guard location: apps/core-api/src/modules/short-video/short-video.service.ts:587 — contains Chốt target tồn tại/visible trước khi ghi report; apps/core-api/src/modules/short-video/short-video.service.spec.ts:525 — contains validate video tồn tại trước khi gọi Safety</w:t>
       </w:r>
     </w:p>
     <w:p>
@@ -2251,7 +2251,7 @@
         <w:pStyle w:val="TableCell"/>
       </w:pPr>
       <w:r>
-        <w:t xml:space="preserve">Guard location: apps/core-api/src/modules/short-video/short-video.service.ts:570 — contains if (distinctReporterCount &gt;= threshold); apps/core-api/src/modules/short-video/short-video.service.ts:577 — contains return this.transition(videoId, VideoStatus.Published, VideoStatus.Removed);</w:t>
+        <w:t xml:space="preserve">Guard location: apps/core-api/src/modules/short-video/short-video.service.ts:598 — contains if (distinctReporterCount &gt;= threshold); apps/core-api/src/modules/short-video/short-video.service.ts:605 — contains return this.transition(videoId, VideoStatus.Published, VideoStatus.Removed);</w:t>
       </w:r>
     </w:p>
     <w:p>
@@ -2291,7 +2291,7 @@
         <w:pStyle w:val="TableCell"/>
       </w:pPr>
       <w:r>
-        <w:t xml:space="preserve">Guard location: apps/core-api/src/modules/safety/safety.service.ts:195 — contains trustPenaltyApplied: 0; apps/core-api/src/modules/short-video/short-video.integration.spec.ts:438 — contains report vượt VIDEOREPORTAUTOHIDE_THRESHOLD</w:t>
+        <w:t xml:space="preserve">Guard location: apps/core-api/src/modules/safety/safety.service.ts:195 — contains trustPenaltyApplied: 0; apps/core-api/src/modules/short-video/short-video.integration.spec.ts:443 — contains report vượt VIDEOREPORTAUTOHIDE_THRESHOLD</w:t>
       </w:r>
     </w:p>
     <w:p>

</xml_diff>

<commit_message>
feat(scale): add bounded runtime and recovery hardening
Consolidate the latest local 10M CCU runtime-hardening changes into one reviewable commit. All earlier PR commits remain unchanged.

Local change stages:
1. Core API: bound request concurrency and database admission.
2. Calling: claim timed-out sessions and recover workers safely.
3. Economy: bound outbox and reconciliation work.
4. Matching: shard queues and repair backlog.
5. Signaling: cap connection admission and outbound queues.
6. Infrastructure: configure bounded runtime and media availability.
7. Release evidence: document recovery checks and rollout evidence.
</commit_message>
<xml_diff>
--- a/docs/generated/product-spec-evidence-report.docx
+++ b/docs/generated/product-spec-evidence-report.docx
@@ -1819,7 +1819,7 @@
         <w:pStyle w:val="ListBullet"/>
       </w:pPr>
       <w:r>
-        <w:t xml:space="preserve">• Implementation evidence: apps/signaling-gateway/src/app/signaling.gateway.ts:56 — contains @WebSocketGateway; libs/common-dtos/src/lib/realtime-events.ts:34 — contains export const RealtimeEvents; apps/signaling-gateway/src/app/connection-quota.service.ts:102 — contains ConnectionQuotaService</w:t>
+        <w:t xml:space="preserve">• Implementation evidence: apps/signaling-gateway/src/app/signaling.gateway.ts:59 — contains @WebSocketGateway; libs/common-dtos/src/lib/realtime-events.ts:34 — contains export const RealtimeEvents; apps/signaling-gateway/src/app/connection-quota.service.ts:113 — contains ConnectionQuotaService</w:t>
       </w:r>
     </w:p>
     <w:p>
@@ -2067,7 +2067,7 @@
         <w:pStyle w:val="ListBullet"/>
       </w:pPr>
       <w:r>
-        <w:t xml:space="preserve">• Source evidence: package.json:43 — contains "agent:check":; scripts/agent/verify.mjs:34 — contains requiredTargets: ['lint', 'test', 'build']</w:t>
+        <w:t xml:space="preserve">• Source evidence: package.json:44 — contains "agent:check":; scripts/agent/verify.mjs:34 — contains requiredTargets: ['lint', 'test', 'build']</w:t>
       </w:r>
     </w:p>
     <w:p>
@@ -2131,7 +2131,7 @@
         <w:pStyle w:val="TableCell"/>
       </w:pPr>
       <w:r>
-        <w:t xml:space="preserve">Guard location: apps/core-api/src/app/app.module.ts:155 — contains { provide: APP_GUARD, useClass: JwtAuthGuard }; apps/core-api/src/modules/short-video/short-video.controller.ts:129 — contains await this.videoService.reportVideo(user, id, dto.reason, dto.description);</w:t>
+        <w:t xml:space="preserve">Guard location: apps/core-api/src/app/app.module.ts:148 — contains { provide: APP_GUARD, useClass: JwtAuthGuard }; apps/core-api/src/modules/short-video/short-video.controller.ts:129 — contains await this.videoService.reportVideo(user, id, dto.reason, dto.description);</w:t>
       </w:r>
     </w:p>
     <w:p>

</xml_diff>